<commit_message>
Add FastAPI application with US Visa prediction form and styling
</commit_message>
<xml_diff>
--- a/documents/US_Visa_ML_Wireframe.docx
+++ b/documents/US_Visa_ML_Wireframe.docx
@@ -10,15 +10,17 @@
         <w:spacing w:before="480" w:lineRule="auto"/>
         <w:rPr>
           <w:b w:val="1"/>
+          <w:bCs w:val="1"/>
           <w:sz w:val="46"/>
           <w:szCs w:val="46"/>
         </w:rPr>
       </w:pPr>
-      <w:bookmarkStart w:colFirst="0" w:colLast="0" w:name="_mky33qf8bpg2" w:id="0"/>
+      <w:bookmarkStart w:colFirst="0" w:colLast="0" w:name="_xtji747diya" w:id="0"/>
       <w:bookmarkEnd w:id="0"/>
       <w:r>
         <w:rPr>
           <w:b w:val="1"/>
+          <w:bCs w:val="1"/>
           <w:sz w:val="46"/>
           <w:szCs w:val="46"/>
           <w:rtl w:val="0"/>
@@ -31,48 +33,45 @@
         <w:spacing w:after="240" w:before="240" w:lineRule="auto"/>
         <w:rPr>
           <w:b w:val="1"/>
-        </w:rPr>
-      </w:pPr>
-      <w:r>
-        <w:rPr>
-          <w:b w:val="1"/>
-          <w:rtl w:val="0"/>
-        </w:rPr>
+          <w:bCs w:val="1"/>
+        </w:rPr>
+      </w:pPr>
+      <w:r>
+        <w:rPr>
+          <w:b w:val="1"/>
+          <w:bCs w:val="1"/>
+          <w:rtl w:val="0"/>
+        </w:rPr>
+        <w:t xml:space="preserve"> Project:</w:t>
+      </w:r>
+      <w:r>
+        <w:rPr>
+          <w:rtl w:val="0"/>
+        </w:rPr>
+        <w:t xml:space="preserve"> US Visa Approval Prediction App (ML-Powered)</w:t>
+        <w:br w:type="textWrapping"/>
         <w:t xml:space="preserve"> </w:t>
       </w:r>
       <w:r>
         <w:rPr>
           <w:b w:val="1"/>
-          <w:rtl w:val="0"/>
-        </w:rPr>
-        <w:t xml:space="preserve">Project:</w:t>
-      </w:r>
-      <w:r>
-        <w:rPr>
-          <w:rtl w:val="0"/>
-        </w:rPr>
-        <w:t xml:space="preserve"> US Visa Approval Prediction App (ML-Powered)</w:t>
+          <w:bCs w:val="1"/>
+          <w:rtl w:val="0"/>
+        </w:rPr>
+        <w:t xml:space="preserve">Version:</w:t>
+      </w:r>
+      <w:r>
+        <w:rPr>
+          <w:rtl w:val="0"/>
+        </w:rPr>
+        <w:t xml:space="preserve"> v1.0</w:t>
         <w:br w:type="textWrapping"/>
         <w:t xml:space="preserve"> </w:t>
       </w:r>
       <w:r>
         <w:rPr>
           <w:b w:val="1"/>
-          <w:rtl w:val="0"/>
-        </w:rPr>
-        <w:t xml:space="preserve">Version:</w:t>
-      </w:r>
-      <w:r>
-        <w:rPr>
-          <w:rtl w:val="0"/>
-        </w:rPr>
-        <w:t xml:space="preserve"> v1.0</w:t>
-        <w:br w:type="textWrapping"/>
-        <w:t xml:space="preserve"> </w:t>
-      </w:r>
-      <w:r>
-        <w:rPr>
-          <w:b w:val="1"/>
+          <w:bCs w:val="1"/>
           <w:rtl w:val="0"/>
         </w:rPr>
         <w:t xml:space="preserve">Design By- Pankaj Kumar Pramanik</w:t>
@@ -101,15 +100,17 @@
         <w:spacing w:after="80" w:lineRule="auto"/>
         <w:rPr>
           <w:b w:val="1"/>
+          <w:bCs w:val="1"/>
           <w:sz w:val="34"/>
           <w:szCs w:val="34"/>
         </w:rPr>
       </w:pPr>
-      <w:bookmarkStart w:colFirst="0" w:colLast="0" w:name="_ja0zmxsf8hby" w:id="1"/>
+      <w:bookmarkStart w:colFirst="0" w:colLast="0" w:name="_q9s41lx5xqw0" w:id="1"/>
       <w:bookmarkEnd w:id="1"/>
       <w:r>
         <w:rPr>
           <w:b w:val="1"/>
+          <w:bCs w:val="1"/>
           <w:sz w:val="34"/>
           <w:szCs w:val="34"/>
           <w:rtl w:val="0"/>
@@ -152,15 +153,17 @@
         <w:spacing w:after="80" w:lineRule="auto"/>
         <w:rPr>
           <w:b w:val="1"/>
+          <w:bCs w:val="1"/>
           <w:sz w:val="34"/>
           <w:szCs w:val="34"/>
         </w:rPr>
       </w:pPr>
-      <w:bookmarkStart w:colFirst="0" w:colLast="0" w:name="_ou5npntbt6zt" w:id="2"/>
+      <w:bookmarkStart w:colFirst="0" w:colLast="0" w:name="_v0ra3rxt9y18" w:id="2"/>
       <w:bookmarkEnd w:id="2"/>
       <w:r>
         <w:rPr>
           <w:b w:val="1"/>
+          <w:bCs w:val="1"/>
           <w:sz w:val="34"/>
           <w:szCs w:val="34"/>
           <w:rtl w:val="0"/>
@@ -176,16 +179,18 @@
         <w:spacing w:before="280" w:lineRule="auto"/>
         <w:rPr>
           <w:b w:val="1"/>
+          <w:bCs w:val="1"/>
           <w:color w:val="000000"/>
           <w:sz w:val="26"/>
           <w:szCs w:val="26"/>
         </w:rPr>
       </w:pPr>
-      <w:bookmarkStart w:colFirst="0" w:colLast="0" w:name="_8yusn9jdz1yi" w:id="3"/>
+      <w:bookmarkStart w:colFirst="0" w:colLast="0" w:name="_6dbvqc88q0x6" w:id="3"/>
       <w:bookmarkEnd w:id="3"/>
       <w:r>
         <w:rPr>
           <w:b w:val="1"/>
+          <w:bCs w:val="1"/>
           <w:color w:val="000000"/>
           <w:sz w:val="26"/>
           <w:szCs w:val="26"/>
@@ -202,16 +207,18 @@
         <w:spacing w:before="280" w:lineRule="auto"/>
         <w:rPr>
           <w:b w:val="1"/>
+          <w:bCs w:val="1"/>
           <w:color w:val="000000"/>
           <w:sz w:val="26"/>
           <w:szCs w:val="26"/>
         </w:rPr>
       </w:pPr>
-      <w:bookmarkStart w:colFirst="0" w:colLast="0" w:name="_mssydzcpjdc5" w:id="4"/>
+      <w:bookmarkStart w:colFirst="0" w:colLast="0" w:name="_1xozbe3w7u2j" w:id="4"/>
       <w:bookmarkEnd w:id="4"/>
       <w:r>
         <w:rPr>
           <w:b w:val="1"/>
+          <w:bCs w:val="1"/>
           <w:color w:val="000000"/>
           <w:sz w:val="26"/>
           <w:szCs w:val="26"/>
@@ -238,16 +245,23 @@
           <w:ilvl w:val="0"/>
           <w:numId w:val="2"/>
         </w:numPr>
-        <w:spacing w:after="0" w:afterAutospacing="0" w:before="240" w:lineRule="auto"/>
+        <w:spacing w:after="0" w:before="240" w:lineRule="auto"/>
         <w:ind w:left="720" w:hanging="360"/>
-      </w:pPr>
-      <w:r>
-        <w:rPr>
-          <w:b w:val="1"/>
+        <w:rPr/>
+      </w:pPr>
+      <w:r>
+        <w:rPr>
+          <w:b w:val="1"/>
+          <w:bCs w:val="1"/>
           <w:rtl w:val="0"/>
         </w:rPr>
         <w:t xml:space="preserve">Fields:</w:t>
         <w:br w:type="textWrapping"/>
+      </w:r>
+      <w:r>
+        <w:rPr>
+          <w:rtl w:val="0"/>
+        </w:rPr>
       </w:r>
     </w:p>
     <w:p>
@@ -256,8 +270,9 @@
           <w:ilvl w:val="1"/>
           <w:numId w:val="2"/>
         </w:numPr>
-        <w:spacing w:after="0" w:afterAutospacing="0" w:before="0" w:beforeAutospacing="0" w:lineRule="auto"/>
+        <w:spacing w:after="0" w:before="0" w:lineRule="auto"/>
         <w:ind w:left="1440" w:hanging="360"/>
+        <w:rPr/>
       </w:pPr>
       <w:r>
         <w:rPr>
@@ -273,8 +288,9 @@
           <w:ilvl w:val="1"/>
           <w:numId w:val="2"/>
         </w:numPr>
-        <w:spacing w:after="0" w:afterAutospacing="0" w:before="0" w:beforeAutospacing="0" w:lineRule="auto"/>
+        <w:spacing w:after="0" w:before="0" w:lineRule="auto"/>
         <w:ind w:left="1440" w:hanging="360"/>
+        <w:rPr/>
       </w:pPr>
       <w:r>
         <w:rPr>
@@ -290,8 +306,9 @@
           <w:ilvl w:val="1"/>
           <w:numId w:val="2"/>
         </w:numPr>
-        <w:spacing w:after="0" w:afterAutospacing="0" w:before="0" w:beforeAutospacing="0" w:lineRule="auto"/>
+        <w:spacing w:after="0" w:before="0" w:lineRule="auto"/>
         <w:ind w:left="1440" w:hanging="360"/>
+        <w:rPr/>
       </w:pPr>
       <w:r>
         <w:rPr>
@@ -307,8 +324,9 @@
           <w:ilvl w:val="1"/>
           <w:numId w:val="2"/>
         </w:numPr>
-        <w:spacing w:after="0" w:afterAutospacing="0" w:before="0" w:beforeAutospacing="0" w:lineRule="auto"/>
+        <w:spacing w:after="0" w:before="0" w:lineRule="auto"/>
         <w:ind w:left="1440" w:hanging="360"/>
+        <w:rPr/>
       </w:pPr>
       <w:r>
         <w:rPr>
@@ -324,8 +342,9 @@
           <w:ilvl w:val="1"/>
           <w:numId w:val="2"/>
         </w:numPr>
-        <w:spacing w:after="0" w:afterAutospacing="0" w:before="0" w:beforeAutospacing="0" w:lineRule="auto"/>
+        <w:spacing w:after="0" w:before="0" w:lineRule="auto"/>
         <w:ind w:left="1440" w:hanging="360"/>
+        <w:rPr/>
       </w:pPr>
       <w:r>
         <w:rPr>
@@ -341,8 +360,9 @@
           <w:ilvl w:val="1"/>
           <w:numId w:val="2"/>
         </w:numPr>
-        <w:spacing w:after="0" w:afterAutospacing="0" w:before="0" w:beforeAutospacing="0" w:lineRule="auto"/>
+        <w:spacing w:after="0" w:before="0" w:lineRule="auto"/>
         <w:ind w:left="1440" w:hanging="360"/>
+        <w:rPr/>
       </w:pPr>
       <w:r>
         <w:rPr>
@@ -358,8 +378,9 @@
           <w:ilvl w:val="1"/>
           <w:numId w:val="2"/>
         </w:numPr>
-        <w:spacing w:after="0" w:afterAutospacing="0" w:before="0" w:beforeAutospacing="0" w:lineRule="auto"/>
+        <w:spacing w:after="0" w:before="0" w:lineRule="auto"/>
         <w:ind w:left="1440" w:hanging="360"/>
+        <w:rPr/>
       </w:pPr>
       <w:r>
         <w:rPr>
@@ -375,8 +396,9 @@
           <w:ilvl w:val="1"/>
           <w:numId w:val="2"/>
         </w:numPr>
-        <w:spacing w:after="0" w:afterAutospacing="0" w:before="0" w:beforeAutospacing="0" w:lineRule="auto"/>
+        <w:spacing w:after="0" w:before="0" w:lineRule="auto"/>
         <w:ind w:left="1440" w:hanging="360"/>
+        <w:rPr/>
       </w:pPr>
       <w:r>
         <w:rPr>
@@ -392,8 +414,9 @@
           <w:ilvl w:val="1"/>
           <w:numId w:val="2"/>
         </w:numPr>
-        <w:spacing w:after="0" w:afterAutospacing="0" w:before="0" w:beforeAutospacing="0" w:lineRule="auto"/>
+        <w:spacing w:after="0" w:before="0" w:lineRule="auto"/>
         <w:ind w:left="1440" w:hanging="360"/>
+        <w:rPr/>
       </w:pPr>
       <w:r>
         <w:rPr>
@@ -409,8 +432,9 @@
           <w:ilvl w:val="1"/>
           <w:numId w:val="2"/>
         </w:numPr>
-        <w:spacing w:after="0" w:afterAutospacing="0" w:before="0" w:beforeAutospacing="0" w:lineRule="auto"/>
+        <w:spacing w:after="0" w:before="0" w:lineRule="auto"/>
         <w:ind w:left="1440" w:hanging="360"/>
+        <w:rPr/>
       </w:pPr>
       <w:r>
         <w:rPr>
@@ -426,12 +450,14 @@
           <w:ilvl w:val="0"/>
           <w:numId w:val="2"/>
         </w:numPr>
-        <w:spacing w:after="0" w:afterAutospacing="0" w:before="0" w:beforeAutospacing="0" w:lineRule="auto"/>
+        <w:spacing w:after="0" w:before="0" w:lineRule="auto"/>
         <w:ind w:left="720" w:hanging="360"/>
-      </w:pPr>
-      <w:r>
-        <w:rPr>
-          <w:b w:val="1"/>
+        <w:rPr/>
+      </w:pPr>
+      <w:r>
+        <w:rPr>
+          <w:b w:val="1"/>
+          <w:bCs w:val="1"/>
           <w:rtl w:val="0"/>
         </w:rPr>
         <w:t xml:space="preserve">Button:</w:t>
@@ -450,12 +476,14 @@
           <w:ilvl w:val="0"/>
           <w:numId w:val="2"/>
         </w:numPr>
-        <w:spacing w:after="240" w:before="0" w:beforeAutospacing="0" w:lineRule="auto"/>
+        <w:spacing w:after="240" w:before="0" w:lineRule="auto"/>
         <w:ind w:left="720" w:hanging="360"/>
-      </w:pPr>
-      <w:r>
-        <w:rPr>
-          <w:b w:val="1"/>
+        <w:rPr/>
+      </w:pPr>
+      <w:r>
+        <w:rPr>
+          <w:b w:val="1"/>
+          <w:bCs w:val="1"/>
           <w:rtl w:val="0"/>
         </w:rPr>
         <w:t xml:space="preserve">Prediction Display:</w:t>
@@ -474,6 +502,11 @@
         </w:rPr>
         <w:t xml:space="preserve">{{context}}</w:t>
         <w:br w:type="textWrapping"/>
+      </w:r>
+      <w:r>
+        <w:rPr>
+          <w:rtl w:val="0"/>
+        </w:rPr>
       </w:r>
     </w:p>
     <w:p>
@@ -484,16 +517,18 @@
         <w:spacing w:before="280" w:lineRule="auto"/>
         <w:rPr>
           <w:b w:val="1"/>
+          <w:bCs w:val="1"/>
           <w:color w:val="000000"/>
           <w:sz w:val="26"/>
           <w:szCs w:val="26"/>
         </w:rPr>
       </w:pPr>
-      <w:bookmarkStart w:colFirst="0" w:colLast="0" w:name="_85dv3fctydvj" w:id="5"/>
+      <w:bookmarkStart w:colFirst="0" w:colLast="0" w:name="_twzarnd9gk8c" w:id="5"/>
       <w:bookmarkEnd w:id="5"/>
       <w:r>
         <w:rPr>
           <w:b w:val="1"/>
+          <w:bCs w:val="1"/>
           <w:color w:val="000000"/>
           <w:sz w:val="26"/>
           <w:szCs w:val="26"/>
@@ -508,16 +543,23 @@
           <w:ilvl w:val="0"/>
           <w:numId w:val="1"/>
         </w:numPr>
-        <w:spacing w:after="0" w:afterAutospacing="0" w:before="240" w:lineRule="auto"/>
+        <w:spacing w:after="0" w:before="240" w:lineRule="auto"/>
         <w:ind w:left="720" w:hanging="360"/>
-      </w:pPr>
-      <w:r>
-        <w:rPr>
-          <w:b w:val="1"/>
+        <w:rPr/>
+      </w:pPr>
+      <w:r>
+        <w:rPr>
+          <w:b w:val="1"/>
+          <w:bCs w:val="1"/>
           <w:rtl w:val="0"/>
         </w:rPr>
         <w:t xml:space="preserve">Components:</w:t>
         <w:br w:type="textWrapping"/>
+      </w:r>
+      <w:r>
+        <w:rPr>
+          <w:rtl w:val="0"/>
+        </w:rPr>
       </w:r>
     </w:p>
     <w:p>
@@ -526,8 +568,9 @@
           <w:ilvl w:val="1"/>
           <w:numId w:val="1"/>
         </w:numPr>
-        <w:spacing w:after="0" w:afterAutospacing="0" w:before="0" w:beforeAutospacing="0" w:lineRule="auto"/>
+        <w:spacing w:after="0" w:before="0" w:lineRule="auto"/>
         <w:ind w:left="1440" w:hanging="360"/>
+        <w:rPr/>
       </w:pPr>
       <w:r>
         <w:rPr>
@@ -543,8 +586,9 @@
           <w:ilvl w:val="1"/>
           <w:numId w:val="1"/>
         </w:numPr>
-        <w:spacing w:after="0" w:afterAutospacing="0" w:before="0" w:beforeAutospacing="0" w:lineRule="auto"/>
+        <w:spacing w:after="0" w:before="0" w:lineRule="auto"/>
         <w:ind w:left="1440" w:hanging="360"/>
+        <w:rPr/>
       </w:pPr>
       <w:r>
         <w:rPr>
@@ -560,8 +604,9 @@
           <w:ilvl w:val="1"/>
           <w:numId w:val="1"/>
         </w:numPr>
-        <w:spacing w:after="240" w:before="0" w:beforeAutospacing="0" w:lineRule="auto"/>
+        <w:spacing w:after="240" w:before="0" w:lineRule="auto"/>
         <w:ind w:left="1440" w:hanging="360"/>
+        <w:rPr/>
       </w:pPr>
       <w:r>
         <w:rPr>
@@ -572,13 +617,15 @@
     </w:p>
     <w:p>
       <w:pPr>
+        <w:spacing w:after="240" w:before="0" w:lineRule="auto"/>
+        <w:ind w:left="0" w:firstLine="0"/>
         <w:rPr/>
       </w:pPr>
       <w:r>
         <w:rPr/>
         <w:drawing>
           <wp:inline distB="114300" distT="114300" distL="114300" distR="114300">
-            <wp:extent cx="5943600" cy="4013200"/>
+            <wp:extent cx="4619625" cy="3662363"/>
             <wp:effectExtent b="0" l="0" r="0" t="0"/>
             <wp:docPr id="1" name="image1.png"/>
             <a:graphic>
@@ -598,7 +645,7 @@
                   <pic:spPr>
                     <a:xfrm>
                       <a:off x="0" y="0"/>
-                      <a:ext cx="5943600" cy="4013200"/>
+                      <a:ext cx="4619625" cy="3662363"/>
                     </a:xfrm>
                     <a:prstGeom prst="rect"/>
                     <a:ln/>
@@ -609,6 +656,18 @@
           </wp:inline>
         </w:drawing>
       </w:r>
+      <w:r>
+        <w:rPr>
+          <w:rtl w:val="0"/>
+        </w:rPr>
+        <w:br w:type="textWrapping"/>
+      </w:r>
+    </w:p>
+    <w:p>
+      <w:pPr>
+        <w:ind w:left="0" w:firstLine="0"/>
+        <w:rPr/>
+      </w:pPr>
       <w:r>
         <w:rPr>
           <w:rtl w:val="0"/>
@@ -913,6 +972,7 @@
     </w:pPr>
     <w:rPr>
       <w:b w:val="0"/>
+      <w:bCs w:val="0"/>
       <w:sz w:val="32"/>
       <w:szCs w:val="32"/>
     </w:rPr>
@@ -929,6 +989,7 @@
     </w:pPr>
     <w:rPr>
       <w:b w:val="0"/>
+      <w:bCs w:val="0"/>
       <w:color w:val="434343"/>
       <w:sz w:val="28"/>
       <w:szCs w:val="28"/>
@@ -978,6 +1039,7 @@
     </w:pPr>
     <w:rPr>
       <w:i w:val="1"/>
+      <w:iCs w:val="1"/>
       <w:color w:val="666666"/>
       <w:sz w:val="22"/>
       <w:szCs w:val="22"/>
@@ -1011,6 +1073,7 @@
     <w:rPr>
       <w:rFonts w:ascii="Arial" w:cs="Arial" w:eastAsia="Arial" w:hAnsi="Arial"/>
       <w:i w:val="0"/>
+      <w:iCs w:val="0"/>
       <w:color w:val="666666"/>
       <w:sz w:val="30"/>
       <w:szCs w:val="30"/>

</xml_diff>